<commit_message>
Add new course entry and update CV documents with latest information
</commit_message>
<xml_diff>
--- a/public/cv/CV_-_Federico_Holc_-_Desarrollador_Web.docx
+++ b/public/cv/CV_-_Federico_Holc_-_Desarrollador_Web.docx
@@ -444,6 +444,7 @@
     <w:p>
       <w:pPr>
         <w:pStyle w:val="Heading2"/>
+        <w:spacing w:before="220" w:lineRule="auto"/>
         <w:rPr>
           <w:b w:val="1"/>
           <w:color w:val="1acc14"/>
@@ -591,8 +592,7 @@
         <w:pStyle w:val="Heading2"/>
         <w:jc w:val="center"/>
         <w:rPr>
-          <w:rFonts w:ascii="Montserrat" w:cs="Montserrat" w:eastAsia="Montserrat" w:hAnsi="Montserrat"/>
-          <w:color w:val="ff5e00"/>
+          <w:b w:val="1"/>
         </w:rPr>
       </w:pPr>
       <w:bookmarkStart w:colFirst="0" w:colLast="0" w:name="_ix08tzly7ffv" w:id="4"/>
@@ -631,9 +631,44 @@
         <w:spacing w:after="0" w:before="0" w:line="276" w:lineRule="auto"/>
         <w:ind w:left="540" w:right="0" w:hanging="360"/>
         <w:jc w:val="left"/>
-        <w:rPr>
-          <w:u w:val="none"/>
-        </w:rPr>
+        <w:rPr/>
+      </w:pPr>
+      <w:r>
+        <w:rPr>
+          <w:b w:val="1"/>
+          <w:rtl w:val="0"/>
+        </w:rPr>
+        <w:t xml:space="preserve">Google Cloud Computing Foundations, </w:t>
+      </w:r>
+      <w:r>
+        <w:rPr>
+          <w:rtl w:val="0"/>
+        </w:rPr>
+        <w:t xml:space="preserve">Google Cloud, 2025.</w:t>
+      </w:r>
+    </w:p>
+    <w:p>
+      <w:pPr>
+        <w:keepNext w:val="0"/>
+        <w:keepLines w:val="0"/>
+        <w:pageBreakBefore w:val="0"/>
+        <w:widowControl w:val="1"/>
+        <w:numPr>
+          <w:ilvl w:val="0"/>
+          <w:numId w:val="6"/>
+        </w:numPr>
+        <w:pBdr>
+          <w:top w:space="0" w:sz="0" w:val="nil"/>
+          <w:left w:space="0" w:sz="0" w:val="nil"/>
+          <w:bottom w:space="0" w:sz="0" w:val="nil"/>
+          <w:right w:space="0" w:sz="0" w:val="nil"/>
+          <w:between w:space="0" w:sz="0" w:val="nil"/>
+        </w:pBdr>
+        <w:shd w:fill="auto" w:val="clear"/>
+        <w:spacing w:after="0" w:before="0" w:line="276" w:lineRule="auto"/>
+        <w:ind w:left="540" w:right="0" w:hanging="360"/>
+        <w:jc w:val="left"/>
+        <w:rPr/>
       </w:pPr>
       <w:r>
         <w:rPr>
@@ -2699,11 +2734,19 @@
       </w:pPr>
     </w:pPrDefault>
   </w:docDefaults>
+  <w:style w:type="table" w:styleId="TableNormal" w:default="1">
+    <w:name w:val="TableNormal"/>
+    <w:tblPr>
+      <w:tblCellMar>
+        <w:top w:w="100.0" w:type="dxa"/>
+        <w:left w:w="100.0" w:type="dxa"/>
+        <w:bottom w:w="100.0" w:type="dxa"/>
+        <w:right w:w="100.0" w:type="dxa"/>
+      </w:tblCellMar>
+    </w:tblPr>
+  </w:style>
   <w:style w:type="paragraph" w:styleId="Normal" w:default="1">
     <w:name w:val="normal"/>
-  </w:style>
-  <w:style w:type="table" w:styleId="TableNormal" w:default="1">
-    <w:name w:val="TableNormal"/>
   </w:style>
   <w:style w:type="paragraph" w:styleId="Heading1">
     <w:name w:val="heading 1"/>

</xml_diff>

<commit_message>
Update CV and resume documents with latest versions
</commit_message>
<xml_diff>
--- a/public/cv/CV_-_Federico_Holc_-_Desarrollador_Web.docx
+++ b/public/cv/CV_-_Federico_Holc_-_Desarrollador_Web.docx
@@ -18,6 +18,7 @@
         <w:rPr>
           <w:rFonts w:ascii="Montserrat" w:cs="Montserrat" w:eastAsia="Montserrat" w:hAnsi="Montserrat"/>
           <w:b w:val="1"/>
+          <w:bCs w:val="1"/>
           <w:sz w:val="50"/>
           <w:szCs w:val="50"/>
           <w:rtl w:val="0"/>
@@ -175,6 +176,7 @@
         <w:rPr>
           <w:rFonts w:ascii="Montserrat" w:cs="Montserrat" w:eastAsia="Montserrat" w:hAnsi="Montserrat"/>
           <w:b w:val="1"/>
+          <w:bCs w:val="1"/>
           <w:color w:val="c7c7c7"/>
           <w:sz w:val="25"/>
           <w:szCs w:val="25"/>
@@ -184,6 +186,7 @@
         <w:rPr>
           <w:rFonts w:ascii="Montserrat" w:cs="Montserrat" w:eastAsia="Montserrat" w:hAnsi="Montserrat"/>
           <w:b w:val="1"/>
+          <w:bCs w:val="1"/>
           <w:color w:val="c7c7c7"/>
           <w:sz w:val="25"/>
           <w:szCs w:val="25"/>
@@ -205,6 +208,7 @@
       <w:r>
         <w:rPr>
           <w:b w:val="1"/>
+          <w:bCs w:val="1"/>
           <w:rtl w:val="0"/>
         </w:rPr>
         <w:t xml:space="preserve">Sobre mí</w:t>
@@ -224,7 +228,7 @@
         <w:rPr>
           <w:rtl w:val="0"/>
         </w:rPr>
-        <w:t xml:space="preserve">¡Hola! Me llamo Fede, soy técnico superior en desarrollo de software y programador web full stack. Mi especialidad es el frontend pero me interesa poder crear productos de principio a fin, por lo que no he dejado de formarme en otras áreas que van desde el diseño gráfico hasta el backend. Además, en el pasado fui sociólogo y profesor en escuelas y en la Universidad de Buenos Aires. He desarrollado software de manera autónoma y en equipos, utilizando metodologías ágiles. En mi portfolio se pueden ver los proyectos en los que he trabajado (y su código), junto con una explicación detallada de los problemas que tuve que superar y los aprendizajes que me dejó cada uno de ellos. Actualmente me encuentro trabajando como programador full stack para una agencia de marketing digital</w:t>
+        <w:t xml:space="preserve">¡Hola! Me llamo Fede, soy desarrollador web full stack con más de un año de experiencia. Mi especialidad es el frontend pero me interesa poder crear productos de principio a fin, por lo que no he dejado de formarme en otras áreas que van desde el diseño gráfico hasta el backend y ahora la implementación de soluciones utilizando inteligencia artificial. He desarrollado software de manera autónoma y en equipos, utilizando metodologías ágiles. Además, en el pasado fui sociólogo y profesor en escuelas y en la Universidad de Buenos Aires. En mi portfolio se pueden ver los proyectos en los que he trabajado (y su código), junto con una explicación detallada de los problemas que tuve que superar y los aprendizajes que me dejó cada uno de ellos. Actualmente me encuentro trabajando como programador full stack para una agencia de marketing digital</w:t>
       </w:r>
       <w:r>
         <w:rPr>
@@ -250,6 +254,7 @@
       <w:r>
         <w:rPr>
           <w:b w:val="1"/>
+          <w:bCs w:val="1"/>
           <w:rtl w:val="0"/>
         </w:rPr>
         <w:t xml:space="preserve">Resumen de calificaciones</w:t>
@@ -447,6 +452,7 @@
         <w:spacing w:before="220" w:lineRule="auto"/>
         <w:rPr>
           <w:b w:val="1"/>
+          <w:bCs w:val="1"/>
           <w:color w:val="1acc14"/>
         </w:rPr>
       </w:pPr>
@@ -455,6 +461,7 @@
       <w:r>
         <w:rPr>
           <w:b w:val="1"/>
+          <w:bCs w:val="1"/>
           <w:rtl w:val="0"/>
         </w:rPr>
         <w:t xml:space="preserve">Formación Académica</w:t>
@@ -476,6 +483,7 @@
       <w:r>
         <w:rPr>
           <w:b w:val="1"/>
+          <w:bCs w:val="1"/>
           <w:rtl w:val="0"/>
         </w:rPr>
         <w:t xml:space="preserve">Tecnicatura</w:t>
@@ -483,6 +491,7 @@
       <w:r>
         <w:rPr>
           <w:b w:val="1"/>
+          <w:bCs w:val="1"/>
           <w:rtl w:val="0"/>
         </w:rPr>
         <w:t xml:space="preserve"> Superior en Desarrollo de Software.</w:t>
@@ -505,6 +514,7 @@
       <w:r>
         <w:rPr>
           <w:b w:val="1"/>
+          <w:bCs w:val="1"/>
           <w:rtl w:val="0"/>
         </w:rPr>
         <w:t xml:space="preserve">Especialización Docente de Nivel Superior en Educación Sexual Integral.</w:t>
@@ -527,6 +537,7 @@
       <w:r>
         <w:rPr>
           <w:b w:val="1"/>
+          <w:bCs w:val="1"/>
           <w:rtl w:val="0"/>
         </w:rPr>
         <w:t xml:space="preserve">Profesorado de Enseñanza Secundaria, Normal y Especial en Sociología.</w:t>
@@ -549,6 +560,7 @@
       <w:r>
         <w:rPr>
           <w:b w:val="1"/>
+          <w:bCs w:val="1"/>
           <w:rtl w:val="0"/>
         </w:rPr>
         <w:t xml:space="preserve">Licenciatura en Sociología. </w:t>
@@ -571,6 +583,7 @@
       <w:r>
         <w:rPr>
           <w:b w:val="1"/>
+          <w:bCs w:val="1"/>
           <w:rtl w:val="0"/>
         </w:rPr>
         <w:t xml:space="preserve">Escuela Técnica en Computación.</w:t>
@@ -593,6 +606,7 @@
         <w:jc w:val="center"/>
         <w:rPr>
           <w:b w:val="1"/>
+          <w:bCs w:val="1"/>
         </w:rPr>
       </w:pPr>
       <w:bookmarkStart w:colFirst="0" w:colLast="0" w:name="_ix08tzly7ffv" w:id="4"/>
@@ -600,6 +614,7 @@
       <w:r>
         <w:rPr>
           <w:b w:val="1"/>
+          <w:bCs w:val="1"/>
           <w:rtl w:val="0"/>
         </w:rPr>
         <w:t xml:space="preserve">Cursos</w:t>
@@ -636,6 +651,7 @@
       <w:r>
         <w:rPr>
           <w:b w:val="1"/>
+          <w:bCs w:val="1"/>
           <w:rtl w:val="0"/>
         </w:rPr>
         <w:t xml:space="preserve">Google Cloud Computing Foundations, </w:t>
@@ -673,6 +689,7 @@
       <w:r>
         <w:rPr>
           <w:b w:val="1"/>
+          <w:bCs w:val="1"/>
           <w:rtl w:val="0"/>
         </w:rPr>
         <w:t xml:space="preserve">AWS Academy Cloud Foundations,</w:t>
@@ -712,6 +729,7 @@
       <w:r>
         <w:rPr>
           <w:b w:val="1"/>
+          <w:bCs w:val="1"/>
           <w:rtl w:val="0"/>
         </w:rPr>
         <w:t xml:space="preserve">Desarrollador Web Full Stack. </w:t>
@@ -751,6 +769,7 @@
       <w:r>
         <w:rPr>
           <w:b w:val="1"/>
+          <w:bCs w:val="1"/>
           <w:rtl w:val="0"/>
         </w:rPr>
         <w:t xml:space="preserve">Codo a Codo 4.0 Full Stack JAVA</w:t>
@@ -790,6 +809,7 @@
       <w:r>
         <w:rPr>
           <w:b w:val="1"/>
+          <w:bCs w:val="1"/>
           <w:rtl w:val="0"/>
         </w:rPr>
         <w:t xml:space="preserve">Responsive Web Design / JavaScript Algorithms and Data Structures / Back End Development and APIs</w:t>
@@ -812,6 +832,7 @@
         <w:jc w:val="center"/>
         <w:rPr>
           <w:b w:val="1"/>
+          <w:bCs w:val="1"/>
           <w:color w:val="ffc300"/>
         </w:rPr>
       </w:pPr>
@@ -820,6 +841,7 @@
       <w:r>
         <w:rPr>
           <w:b w:val="1"/>
+          <w:bCs w:val="1"/>
           <w:rtl w:val="0"/>
         </w:rPr>
         <w:t xml:space="preserve">Idiomas</w:t>
@@ -841,6 +863,7 @@
       <w:r>
         <w:rPr>
           <w:b w:val="1"/>
+          <w:bCs w:val="1"/>
           <w:rtl w:val="0"/>
         </w:rPr>
         <w:t xml:space="preserve">Español:</w:t>
@@ -863,6 +886,7 @@
       <w:r>
         <w:rPr>
           <w:b w:val="1"/>
+          <w:bCs w:val="1"/>
           <w:rtl w:val="0"/>
         </w:rPr>
         <w:t xml:space="preserve">Inglés:</w:t>
@@ -889,6 +913,7 @@
       <w:r>
         <w:rPr>
           <w:b w:val="1"/>
+          <w:bCs w:val="1"/>
           <w:rtl w:val="0"/>
         </w:rPr>
         <w:t xml:space="preserve">Experiencia Laboral</w:t>
@@ -903,6 +928,7 @@
       <w:pPr>
         <w:rPr>
           <w:b w:val="1"/>
+          <w:bCs w:val="1"/>
           <w:sz w:val="24"/>
           <w:szCs w:val="24"/>
         </w:rPr>
@@ -910,6 +936,7 @@
       <w:r>
         <w:rPr>
           <w:b w:val="1"/>
+          <w:bCs w:val="1"/>
           <w:sz w:val="24"/>
           <w:szCs w:val="24"/>
           <w:rtl w:val="0"/>
@@ -947,6 +974,7 @@
       <w:pPr>
         <w:rPr>
           <w:b w:val="1"/>
+          <w:bCs w:val="1"/>
           <w:sz w:val="24"/>
           <w:szCs w:val="24"/>
         </w:rPr>
@@ -954,6 +982,7 @@
       <w:r>
         <w:rPr>
           <w:b w:val="1"/>
+          <w:bCs w:val="1"/>
           <w:sz w:val="24"/>
           <w:szCs w:val="24"/>
           <w:rtl w:val="0"/>
@@ -991,6 +1020,7 @@
       <w:pPr>
         <w:rPr>
           <w:b w:val="1"/>
+          <w:bCs w:val="1"/>
           <w:sz w:val="24"/>
           <w:szCs w:val="24"/>
         </w:rPr>
@@ -998,6 +1028,7 @@
       <w:r>
         <w:rPr>
           <w:b w:val="1"/>
+          <w:bCs w:val="1"/>
           <w:sz w:val="24"/>
           <w:szCs w:val="24"/>
           <w:rtl w:val="0"/>
@@ -1066,6 +1097,7 @@
         <w:ind w:left="0" w:firstLine="0"/>
         <w:rPr>
           <w:b w:val="1"/>
+          <w:bCs w:val="1"/>
           <w:sz w:val="24"/>
           <w:szCs w:val="24"/>
         </w:rPr>
@@ -1073,6 +1105,7 @@
       <w:r>
         <w:rPr>
           <w:b w:val="1"/>
+          <w:bCs w:val="1"/>
           <w:sz w:val="24"/>
           <w:szCs w:val="24"/>
           <w:rtl w:val="0"/>
@@ -1132,6 +1165,7 @@
         <w:rPr>
           <w:rFonts w:ascii="Montserrat" w:cs="Montserrat" w:eastAsia="Montserrat" w:hAnsi="Montserrat"/>
           <w:b w:val="1"/>
+          <w:bCs w:val="1"/>
           <w:sz w:val="24"/>
           <w:szCs w:val="24"/>
         </w:rPr>
@@ -1139,6 +1173,7 @@
       <w:r>
         <w:rPr>
           <w:b w:val="1"/>
+          <w:bCs w:val="1"/>
           <w:sz w:val="24"/>
           <w:szCs w:val="24"/>
           <w:rtl w:val="0"/>
@@ -1186,6 +1221,7 @@
         <w:jc w:val="center"/>
         <w:rPr>
           <w:b w:val="1"/>
+          <w:bCs w:val="1"/>
           <w:color w:val="ff008c"/>
         </w:rPr>
       </w:pPr>
@@ -1194,6 +1230,7 @@
       <w:r>
         <w:rPr>
           <w:b w:val="1"/>
+          <w:bCs w:val="1"/>
           <w:rtl w:val="0"/>
         </w:rPr>
         <w:t xml:space="preserve">Proyectos de desarrollo </w:t>
@@ -1214,6 +1251,7 @@
       <w:pPr>
         <w:rPr>
           <w:b w:val="1"/>
+          <w:bCs w:val="1"/>
           <w:color w:val="0d0d0d"/>
           <w:sz w:val="26"/>
           <w:szCs w:val="26"/>
@@ -1222,6 +1260,7 @@
       <w:r>
         <w:rPr>
           <w:b w:val="1"/>
+          <w:bCs w:val="1"/>
           <w:sz w:val="24"/>
           <w:szCs w:val="24"/>
           <w:rtl w:val="0"/>
@@ -1231,6 +1270,7 @@
       <w:r>
         <w:rPr>
           <w:b w:val="1"/>
+          <w:bCs w:val="1"/>
           <w:color w:val="0d0d0d"/>
           <w:sz w:val="26"/>
           <w:szCs w:val="26"/>
@@ -1309,6 +1349,7 @@
         <w:ind w:left="720" w:firstLine="0"/>
         <w:rPr>
           <w:b w:val="1"/>
+          <w:bCs w:val="1"/>
           <w:sz w:val="24"/>
           <w:szCs w:val="24"/>
         </w:rPr>
@@ -1323,6 +1364,7 @@
       <w:pPr>
         <w:rPr>
           <w:b w:val="1"/>
+          <w:bCs w:val="1"/>
           <w:sz w:val="24"/>
           <w:szCs w:val="24"/>
         </w:rPr>
@@ -1330,6 +1372,7 @@
       <w:r>
         <w:rPr>
           <w:b w:val="1"/>
+          <w:bCs w:val="1"/>
           <w:sz w:val="24"/>
           <w:szCs w:val="24"/>
           <w:rtl w:val="0"/>
@@ -1449,6 +1492,7 @@
       <w:pPr>
         <w:rPr>
           <w:b w:val="1"/>
+          <w:bCs w:val="1"/>
           <w:sz w:val="24"/>
           <w:szCs w:val="24"/>
         </w:rPr>
@@ -1456,6 +1500,7 @@
       <w:r>
         <w:rPr>
           <w:b w:val="1"/>
+          <w:bCs w:val="1"/>
           <w:sz w:val="24"/>
           <w:szCs w:val="24"/>
           <w:rtl w:val="0"/>
@@ -1544,6 +1589,7 @@
       <w:pPr>
         <w:rPr>
           <w:b w:val="1"/>
+          <w:bCs w:val="1"/>
           <w:sz w:val="24"/>
           <w:szCs w:val="24"/>
         </w:rPr>
@@ -1551,6 +1597,7 @@
       <w:r>
         <w:rPr>
           <w:b w:val="1"/>
+          <w:bCs w:val="1"/>
           <w:sz w:val="24"/>
           <w:szCs w:val="24"/>
           <w:rtl w:val="0"/>
@@ -1632,6 +1679,7 @@
       <w:pPr>
         <w:rPr>
           <w:b w:val="1"/>
+          <w:bCs w:val="1"/>
           <w:sz w:val="24"/>
           <w:szCs w:val="24"/>
         </w:rPr>
@@ -1639,6 +1687,7 @@
       <w:r>
         <w:rPr>
           <w:b w:val="1"/>
+          <w:bCs w:val="1"/>
           <w:sz w:val="24"/>
           <w:szCs w:val="24"/>
           <w:rtl w:val="0"/>
@@ -1648,6 +1697,7 @@
       <w:r>
         <w:rPr>
           <w:b w:val="1"/>
+          <w:bCs w:val="1"/>
           <w:sz w:val="24"/>
           <w:szCs w:val="24"/>
           <w:rtl w:val="0"/>
@@ -1657,6 +1707,7 @@
       <w:r>
         <w:rPr>
           <w:b w:val="1"/>
+          <w:bCs w:val="1"/>
           <w:sz w:val="24"/>
           <w:szCs w:val="24"/>
           <w:rtl w:val="0"/>
@@ -1738,6 +1789,7 @@
       <w:pPr>
         <w:rPr>
           <w:b w:val="1"/>
+          <w:bCs w:val="1"/>
           <w:sz w:val="24"/>
           <w:szCs w:val="24"/>
         </w:rPr>
@@ -1745,6 +1797,7 @@
       <w:r>
         <w:rPr>
           <w:b w:val="1"/>
+          <w:bCs w:val="1"/>
           <w:sz w:val="24"/>
           <w:szCs w:val="24"/>
           <w:rtl w:val="0"/>
@@ -2775,6 +2828,7 @@
     </w:pPr>
     <w:rPr>
       <w:b w:val="1"/>
+      <w:bCs w:val="1"/>
       <w:sz w:val="32"/>
       <w:szCs w:val="32"/>
     </w:rPr>
@@ -2791,6 +2845,7 @@
     </w:pPr>
     <w:rPr>
       <w:b w:val="0"/>
+      <w:bCs w:val="0"/>
       <w:color w:val="434343"/>
       <w:sz w:val="28"/>
       <w:szCs w:val="28"/>
@@ -2840,6 +2895,7 @@
     </w:pPr>
     <w:rPr>
       <w:i w:val="1"/>
+      <w:iCs w:val="1"/>
       <w:color w:val="666666"/>
       <w:sz w:val="22"/>
       <w:szCs w:val="22"/>
@@ -2873,6 +2929,7 @@
     <w:rPr>
       <w:rFonts w:ascii="Arial" w:cs="Arial" w:eastAsia="Arial" w:hAnsi="Arial"/>
       <w:i w:val="0"/>
+      <w:iCs w:val="0"/>
       <w:color w:val="666666"/>
       <w:sz w:val="30"/>
       <w:szCs w:val="30"/>

</xml_diff>